<commit_message>
Agregar boton "Ver detalle" y corregir las tildes de los titulos del informe
Panel
- Cada tarjeta del Kanban suma un boton explicito "Ver detalle" junto a
  Editar y Eliminar. El nombre del candidato sigue siendo un enlace, pero
  como unico acceso no era descubrible.

Titulos del informe
- El generador de plantillas producia las columnas "Areas de mejora" y
  "Conclusion" sin tilde, y de ahi salen las secciones del informe. Se
  corrigen en el generador y se regeneran las plantillas de las cuatro
  familias. Tambien se corrigen los nombres "Atencion al Cliente" y
  "Administracion" usados como titulo de la pauta, que habian quedado
  desalineados con los nombres ya migrados en la base.
- Nuevo migrarTitulosInformes.js: los titulos se guardan junto al informe,
  asi que corregir las plantillas no arreglaba los informes existentes.
  El script los actualiza conservando el contenido de cada seccion, y es
  idempotente.
</commit_message>
<xml_diff>
--- a/backend/plantillas/administracion/pauta_entrevista.docx
+++ b/backend/plantillas/administracion/pauta_entrevista.docx
@@ -7,7 +7,7 @@
         <w:pStyle w:val="Heading1"/>
       </w:pPr>
       <w:r>
-        <w:t xml:space="preserve">Pauta de Entrevista - Administracion</w:t>
+        <w:t xml:space="preserve">Pauta de Entrevista - Administración</w:t>
       </w:r>
     </w:p>
     <w:p/>
@@ -71,7 +71,7 @@
         <w:pStyle w:val="Heading2"/>
       </w:pPr>
       <w:r>
-        <w:t xml:space="preserve">Preguntas especificas: Administracion</w:t>
+        <w:t xml:space="preserve">Preguntas especificas: Administración</w:t>
       </w:r>
     </w:p>
     <w:p>

</xml_diff>

<commit_message>
Corregir tildes y signos de apertura en las pautas de entrevista
Las preguntas de las pautas .docx estaban sin tildes y sin signos de
apertura ("Por que decidio postular a este cargo?"). Se corrigen en el
generador y se regeneran las plantillas de las cuatro familias:

- Las 5 preguntas generales, comunes a todas las familias.
- Las 12 preguntas especificas (3 por familia).
- El encabezado "Preguntas especificas", que tampoco llevaba tilde.

Se mantiene el tratamiento de usted, que es el que corresponde a una
pauta de entrevista formal.
</commit_message>
<xml_diff>
--- a/backend/plantillas/administracion/pauta_entrevista.docx
+++ b/backend/plantillas/administracion/pauta_entrevista.docx
@@ -42,27 +42,27 @@
     </w:p>
     <w:p>
       <w:r>
-        <w:t xml:space="preserve">1. Cuenteme brevemente sobre su trayectoria laboral.</w:t>
-      </w:r>
-    </w:p>
-    <w:p>
-      <w:r>
-        <w:t xml:space="preserve">2. Por que decidio postular a este cargo?</w:t>
-      </w:r>
-    </w:p>
-    <w:p>
-      <w:r>
-        <w:t xml:space="preserve">3. Describa una situacion dificil que haya enfrentado en un trabajo anterior y como la resolvio.</w:t>
-      </w:r>
-    </w:p>
-    <w:p>
-      <w:r>
-        <w:t xml:space="preserve">4. Como maneja el trabajo bajo presion o con plazos ajustados?</w:t>
-      </w:r>
-    </w:p>
-    <w:p>
-      <w:r>
-        <w:t xml:space="preserve">5. Que espera de este nuevo trabajo?</w:t>
+        <w:t xml:space="preserve">1. Cuénteme brevemente sobre su trayectoria laboral.</w:t>
+      </w:r>
+    </w:p>
+    <w:p>
+      <w:r>
+        <w:t xml:space="preserve">2. ¿Por qué decidió postular a este cargo?</w:t>
+      </w:r>
+    </w:p>
+    <w:p>
+      <w:r>
+        <w:t xml:space="preserve">3. Describa una situación difícil que haya enfrentado en un trabajo anterior y cómo la resolvió.</w:t>
+      </w:r>
+    </w:p>
+    <w:p>
+      <w:r>
+        <w:t xml:space="preserve">4. ¿Cómo maneja el trabajo bajo presión o con plazos ajustados?</w:t>
+      </w:r>
+    </w:p>
+    <w:p>
+      <w:r>
+        <w:t xml:space="preserve">5. ¿Qué espera de este nuevo trabajo?</w:t>
       </w:r>
     </w:p>
     <w:p/>
@@ -71,22 +71,22 @@
         <w:pStyle w:val="Heading2"/>
       </w:pPr>
       <w:r>
-        <w:t xml:space="preserve">Preguntas especificas: Administración</w:t>
-      </w:r>
-    </w:p>
-    <w:p>
-      <w:r>
-        <w:t xml:space="preserve">1. Como organiza sus tareas cuando tiene multiples pendientes administrativos?</w:t>
-      </w:r>
-    </w:p>
-    <w:p>
-      <w:r>
-        <w:t xml:space="preserve">2. Cuenteme sobre su experiencia manejando documentacion o procesos internos.</w:t>
-      </w:r>
-    </w:p>
-    <w:p>
-      <w:r>
-        <w:t xml:space="preserve">3. Que herramientas o sistemas administrativos domina?</w:t>
+        <w:t xml:space="preserve">Preguntas específicas: Administración</w:t>
+      </w:r>
+    </w:p>
+    <w:p>
+      <w:r>
+        <w:t xml:space="preserve">1. ¿Cómo organiza sus tareas cuando tiene múltiples pendientes administrativos?</w:t>
+      </w:r>
+    </w:p>
+    <w:p>
+      <w:r>
+        <w:t xml:space="preserve">2. Cuénteme sobre su experiencia manejando documentación o procesos internos.</w:t>
+      </w:r>
+    </w:p>
+    <w:p>
+      <w:r>
+        <w:t xml:space="preserve">3. ¿Qué herramientas o sistemas administrativos domina?</w:t>
       </w:r>
     </w:p>
     <w:p/>

</xml_diff>